<commit_message>
Changed the title name
</commit_message>
<xml_diff>
--- a/kennedy system proposal.docx
+++ b/kennedy system proposal.docx
@@ -18,44 +18,46 @@
           <w:b/>
           <w:bCs/>
         </w:rPr>
-        <w:t>Predicting House Prices in Kenya</w:t>
-      </w:r>
-    </w:p>
-    <w:p>
-      <w:pPr>
-        <w:spacing w:line="276" w:lineRule="auto"/>
-        <w:jc w:val="center"/>
+        <w:t xml:space="preserve">Machine learning model for predicting house pricing in </w:t>
+      </w:r>
+      <w:proofErr w:type="spellStart"/>
+      <w:r>
         <w:rPr>
           <w:rFonts w:ascii="Montserrat" w:hAnsi="Montserrat"/>
           <w:b/>
           <w:bCs/>
         </w:rPr>
-      </w:pPr>
-      <w:r>
+        <w:t>kenya</w:t>
+      </w:r>
+      <w:proofErr w:type="spellEnd"/>
+    </w:p>
+    <w:p>
+      <w:pPr>
+        <w:spacing w:line="276" w:lineRule="auto"/>
+        <w:jc w:val="center"/>
+        <w:rPr>
+          <w:rFonts w:ascii="Montserrat" w:hAnsi="Montserrat"/>
+        </w:rPr>
+      </w:pPr>
+    </w:p>
+    <w:p>
+      <w:pPr>
+        <w:spacing w:line="276" w:lineRule="auto"/>
+        <w:jc w:val="center"/>
+        <w:rPr>
+          <w:rFonts w:ascii="Montserrat" w:hAnsi="Montserrat"/>
+        </w:rPr>
+      </w:pPr>
+    </w:p>
+    <w:p>
+      <w:pPr>
+        <w:spacing w:line="276" w:lineRule="auto"/>
+        <w:jc w:val="center"/>
         <w:rPr>
           <w:rFonts w:ascii="Montserrat" w:hAnsi="Montserrat"/>
           <w:b/>
           <w:bCs/>
         </w:rPr>
-        <w:t>NYUMBA SENSE ML</w:t>
-      </w:r>
-    </w:p>
-    <w:p>
-      <w:pPr>
-        <w:spacing w:line="276" w:lineRule="auto"/>
-        <w:jc w:val="center"/>
-        <w:rPr>
-          <w:rFonts w:ascii="Montserrat" w:hAnsi="Montserrat"/>
-        </w:rPr>
-      </w:pPr>
-    </w:p>
-    <w:p>
-      <w:pPr>
-        <w:spacing w:line="276" w:lineRule="auto"/>
-        <w:jc w:val="center"/>
-        <w:rPr>
-          <w:rFonts w:ascii="Montserrat" w:hAnsi="Montserrat"/>
-        </w:rPr>
       </w:pPr>
     </w:p>
     <w:p>
@@ -68,25 +70,25 @@
           <w:bCs/>
         </w:rPr>
       </w:pPr>
-    </w:p>
-    <w:p>
-      <w:pPr>
-        <w:spacing w:line="276" w:lineRule="auto"/>
-        <w:jc w:val="center"/>
+      <w:r>
         <w:rPr>
           <w:rFonts w:ascii="Montserrat" w:hAnsi="Montserrat"/>
           <w:b/>
           <w:bCs/>
         </w:rPr>
-      </w:pPr>
-      <w:r>
+        <w:t>SYSTEM PROPOSAL</w:t>
+      </w:r>
+    </w:p>
+    <w:p>
+      <w:pPr>
+        <w:spacing w:line="276" w:lineRule="auto"/>
+        <w:jc w:val="center"/>
         <w:rPr>
           <w:rFonts w:ascii="Montserrat" w:hAnsi="Montserrat"/>
           <w:b/>
           <w:bCs/>
         </w:rPr>
-        <w:t>SYSTEM PROPOSAL</w:t>
-      </w:r>
+      </w:pPr>
     </w:p>
     <w:p>
       <w:pPr>
@@ -131,24 +133,21 @@
           <w:bCs/>
         </w:rPr>
       </w:pPr>
-    </w:p>
-    <w:p>
-      <w:pPr>
-        <w:spacing w:line="276" w:lineRule="auto"/>
-        <w:jc w:val="center"/>
+      <w:r>
         <w:rPr>
           <w:rFonts w:ascii="Montserrat" w:hAnsi="Montserrat"/>
           <w:b/>
           <w:bCs/>
         </w:rPr>
-      </w:pPr>
+        <w:t>SUBMITTED BY,</w:t>
+      </w:r>
       <w:r>
         <w:rPr>
           <w:rFonts w:ascii="Montserrat" w:hAnsi="Montserrat"/>
           <w:b/>
           <w:bCs/>
         </w:rPr>
-        <w:t>SUBMITTED BY,</w:t>
+        <w:br/>
       </w:r>
       <w:r>
         <w:rPr>
@@ -156,7 +155,7 @@
           <w:b/>
           <w:bCs/>
         </w:rPr>
-        <w:br/>
+        <w:t>KENNEDY KARIUKI MAINA</w:t>
       </w:r>
       <w:r>
         <w:rPr>
@@ -164,7 +163,7 @@
           <w:b/>
           <w:bCs/>
         </w:rPr>
-        <w:t>KENNEDY KARIUKI MAINA</w:t>
+        <w:br/>
       </w:r>
       <w:r>
         <w:rPr>
@@ -172,16 +171,19 @@
           <w:b/>
           <w:bCs/>
         </w:rPr>
-        <w:br/>
-      </w:r>
-      <w:r>
+        <w:t>DDA-03-0116/2025</w:t>
+      </w:r>
+    </w:p>
+    <w:p>
+      <w:pPr>
+        <w:spacing w:line="276" w:lineRule="auto"/>
+        <w:jc w:val="center"/>
         <w:rPr>
           <w:rFonts w:ascii="Montserrat" w:hAnsi="Montserrat"/>
           <w:b/>
           <w:bCs/>
         </w:rPr>
-        <w:t>DDA-03-0116/2025</w:t>
-      </w:r>
+      </w:pPr>
     </w:p>
     <w:p>
       <w:pPr>
@@ -248,25 +250,25 @@
           <w:bCs/>
         </w:rPr>
       </w:pPr>
-    </w:p>
-    <w:p>
-      <w:pPr>
-        <w:spacing w:line="276" w:lineRule="auto"/>
-        <w:jc w:val="center"/>
+      <w:r>
         <w:rPr>
           <w:rFonts w:ascii="Montserrat" w:hAnsi="Montserrat"/>
           <w:b/>
           <w:bCs/>
         </w:rPr>
-      </w:pPr>
-      <w:r>
+        <w:t>A RESEARCH SYSTEM PROPOSAL SUBMITTED IN FULFILMENT FOR PROGRESSION TO SYSTEM PROJECT, TO THE DEPARTMENT OF ICT AND ENGINEERING OF ZETECH UNIVERSITY</w:t>
+      </w:r>
+    </w:p>
+    <w:p>
+      <w:pPr>
+        <w:spacing w:line="276" w:lineRule="auto"/>
+        <w:jc w:val="center"/>
         <w:rPr>
           <w:rFonts w:ascii="Montserrat" w:hAnsi="Montserrat"/>
           <w:b/>
           <w:bCs/>
         </w:rPr>
-        <w:t>A RESEARCH SYSTEM PROPOSAL SUBMITTED IN FULFILMENT FOR PROGRESSION TO SYSTEM PROJECT, TO THE DEPARTMENT OF ICT AND ENGINEERING OF ZETECH UNIVERSITY</w:t>
-      </w:r>
+      </w:pPr>
     </w:p>
     <w:p>
       <w:pPr>
@@ -311,28 +313,23 @@
           <w:bCs/>
         </w:rPr>
       </w:pPr>
-    </w:p>
-    <w:p>
-      <w:pPr>
-        <w:spacing w:line="276" w:lineRule="auto"/>
-        <w:jc w:val="center"/>
+      <w:r>
         <w:rPr>
           <w:rFonts w:ascii="Montserrat" w:hAnsi="Montserrat"/>
           <w:b/>
           <w:bCs/>
         </w:rPr>
-      </w:pPr>
-      <w:r>
-        <w:rPr>
-          <w:rFonts w:ascii="Montserrat" w:hAnsi="Montserrat"/>
-          <w:b/>
-          <w:bCs/>
-        </w:rPr>
         <w:t>SEP 2026</w:t>
       </w:r>
     </w:p>
     <w:sdt>
       <w:sdtPr>
+        <w:rPr>
+          <w:rFonts w:ascii="Times New Roman" w:eastAsiaTheme="minorHAnsi" w:hAnsi="Times New Roman" w:cstheme="minorBidi"/>
+          <w:b w:val="0"/>
+          <w:sz w:val="24"/>
+          <w:szCs w:val="24"/>
+        </w:rPr>
         <w:id w:val="1004783752"/>
         <w:docPartObj>
           <w:docPartGallery w:val="Table of Contents"/>
@@ -341,11 +338,8 @@
       </w:sdtPr>
       <w:sdtEndPr>
         <w:rPr>
-          <w:rFonts w:ascii="Times New Roman" w:eastAsiaTheme="minorHAnsi" w:hAnsi="Times New Roman" w:cstheme="minorBidi"/>
           <w:bCs/>
           <w:noProof/>
-          <w:sz w:val="24"/>
-          <w:szCs w:val="24"/>
         </w:rPr>
       </w:sdtEndPr>
       <w:sdtContent>
@@ -1377,7 +1371,7 @@
           <w:sz w:val="22"/>
           <w:szCs w:val="22"/>
         </w:rPr>
-        <w:t>To identify the key features (property attributes, location, amenities, and surrounding infrastructure) that influence house prices.</w:t>
+        <w:t>To identify the key features that influence house prices.</w:t>
       </w:r>
     </w:p>
     <w:p>
@@ -1426,29 +1420,8 @@
     </w:p>
     <w:p>
       <w:pPr>
-        <w:numPr>
-          <w:ilvl w:val="0"/>
-          <w:numId w:val="1"/>
-        </w:numPr>
-        <w:spacing w:line="276" w:lineRule="auto"/>
-        <w:rPr>
-          <w:rFonts w:ascii="Montserrat" w:hAnsi="Montserrat"/>
-          <w:sz w:val="22"/>
-          <w:szCs w:val="22"/>
-        </w:rPr>
-      </w:pPr>
-      <w:r>
-        <w:rPr>
-          <w:rFonts w:ascii="Montserrat" w:hAnsi="Montserrat"/>
-          <w:sz w:val="22"/>
-          <w:szCs w:val="22"/>
-        </w:rPr>
-        <w:t>To provide actionable insights for buyers, sellers, investors, and policymakers based on the findings.</w:t>
-      </w:r>
-    </w:p>
-    <w:p>
-      <w:pPr>
-        <w:spacing w:line="276" w:lineRule="auto"/>
+        <w:spacing w:line="276" w:lineRule="auto"/>
+        <w:ind w:left="720"/>
         <w:rPr>
           <w:rFonts w:ascii="Montserrat" w:hAnsi="Montserrat"/>
           <w:sz w:val="22"/>
@@ -1493,23 +1466,7 @@
           <w:sz w:val="22"/>
           <w:szCs w:val="22"/>
         </w:rPr>
-        <w:t xml:space="preserve"> </w:t>
-      </w:r>
-      <w:r>
-        <w:rPr>
-          <w:rFonts w:ascii="Montserrat" w:hAnsi="Montserrat"/>
-          <w:sz w:val="22"/>
-          <w:szCs w:val="22"/>
-        </w:rPr>
-        <w:t>property details, location, amenities and surroundings</w:t>
-      </w:r>
-      <w:r>
-        <w:rPr>
-          <w:rFonts w:ascii="Montserrat" w:hAnsi="Montserrat"/>
-          <w:sz w:val="22"/>
-          <w:szCs w:val="22"/>
-        </w:rPr>
-        <w:t xml:space="preserve">. </w:t>
+        <w:t xml:space="preserve"> property details, location, amenities and surroundings. </w:t>
       </w:r>
     </w:p>
     <w:p>
@@ -1597,7 +1554,6 @@
       </w:pPr>
       <w:bookmarkStart w:id="8" w:name="_Toc241248453"/>
       <w:r>
-        <w:lastRenderedPageBreak/>
         <w:t xml:space="preserve">1.6 </w:t>
       </w:r>
       <w:r>
@@ -1668,6 +1624,7 @@
           <w:sz w:val="22"/>
           <w:szCs w:val="22"/>
         </w:rPr>
+        <w:lastRenderedPageBreak/>
         <w:t>How accurately can machine learning models predict house prices in Kenya?</w:t>
       </w:r>
     </w:p>
@@ -2575,6 +2532,7 @@
   <w:style w:type="character" w:default="1" w:styleId="DefaultParagraphFont">
     <w:name w:val="Default Paragraph Font"/>
     <w:uiPriority w:val="1"/>
+    <w:semiHidden/>
     <w:unhideWhenUsed/>
   </w:style>
   <w:style w:type="table" w:default="1" w:styleId="TableNormal">

</xml_diff>